<commit_message>
Actualizacion de documentos pendientes
</commit_message>
<xml_diff>
--- a/Fase 2/Evidencias Individuales/Arce_Alexander_2.2_APT122_AutoevaluacionAvance_Fase2.docx
+++ b/Fase 2/Evidencias Individuales/Arce_Alexander_2.2_APT122_AutoevaluacionAvance_Fase2.docx
@@ -363,6 +363,7 @@
                 <w:lang w:eastAsia="es-CL"/>
               </w:rPr>
             </w:pPr>
+            <w:proofErr w:type="spellStart"/>
             <w:r>
               <w:rPr>
                 <w:rFonts w:asciiTheme="minorHAnsi" w:eastAsiaTheme="minorEastAsia" w:hAnsiTheme="minorHAnsi" w:cstheme="minorBidi"/>
@@ -373,6 +374,7 @@
               </w:rPr>
               <w:t>Capstone</w:t>
             </w:r>
+            <w:proofErr w:type="spellEnd"/>
           </w:p>
         </w:tc>
         <w:tc>
@@ -2932,6 +2934,7 @@
                 <w:lang w:val="es-ES"/>
               </w:rPr>
             </w:pPr>
+            <w:proofErr w:type="spellStart"/>
             <w:r>
               <w:rPr>
                 <w:rStyle w:val="normaltextrun"/>
@@ -2941,7 +2944,19 @@
                 <w:szCs w:val="22"/>
                 <w:lang w:val="es-CL"/>
               </w:rPr>
-              <w:t>Abstract (inglés y español) </w:t>
+              <w:t>Abstract</w:t>
+            </w:r>
+            <w:proofErr w:type="spellEnd"/>
+            <w:r>
+              <w:rPr>
+                <w:rStyle w:val="normaltextrun"/>
+                <w:rFonts w:ascii="Calibri" w:eastAsia="Calibri" w:hAnsi="Calibri" w:cs="Calibri"/>
+                <w:color w:val="000000" w:themeColor="text1"/>
+                <w:sz w:val="22"/>
+                <w:szCs w:val="22"/>
+                <w:lang w:val="es-CL"/>
+              </w:rPr>
+              <w:t xml:space="preserve"> (inglés y español) </w:t>
             </w:r>
           </w:p>
           <w:p>
@@ -3139,6 +3154,7 @@
               </w:rPr>
               <w:t xml:space="preserve">Formato informe técnico: Portada, índice, </w:t>
             </w:r>
+            <w:proofErr w:type="spellStart"/>
             <w:r>
               <w:rPr>
                 <w:rFonts w:ascii="Calibri" w:eastAsia="Calibri" w:hAnsi="Calibri" w:cs="Calibri"/>
@@ -3155,7 +3171,17 @@
                 <w:sz w:val="22"/>
                 <w:szCs w:val="22"/>
               </w:rPr>
-              <w:t>bstract, desarrollo de ingeniería, conclusiones y reflexiones individuales.</w:t>
+              <w:t>bstract</w:t>
+            </w:r>
+            <w:proofErr w:type="spellEnd"/>
+            <w:r>
+              <w:rPr>
+                <w:rFonts w:ascii="Calibri" w:eastAsia="Calibri" w:hAnsi="Calibri" w:cs="Calibri"/>
+                <w:color w:val="000000" w:themeColor="text1"/>
+                <w:sz w:val="22"/>
+                <w:szCs w:val="22"/>
+              </w:rPr>
+              <w:t>, desarrollo de ingeniería, conclusiones y reflexiones individuales.</w:t>
             </w:r>
           </w:p>
           <w:p>
@@ -3207,8 +3233,39 @@
                 <w:sz w:val="22"/>
                 <w:szCs w:val="22"/>
               </w:rPr>
-              <w:t>Letra: Arial, verdana o calibri</w:t>
-            </w:r>
+              <w:t xml:space="preserve">Letra: Arial, </w:t>
+            </w:r>
+            <w:proofErr w:type="spellStart"/>
+            <w:r>
+              <w:rPr>
+                <w:rFonts w:ascii="Calibri" w:eastAsia="Calibri" w:hAnsi="Calibri" w:cs="Calibri"/>
+                <w:color w:val="000000" w:themeColor="text1"/>
+                <w:sz w:val="22"/>
+                <w:szCs w:val="22"/>
+              </w:rPr>
+              <w:t>verdana</w:t>
+            </w:r>
+            <w:proofErr w:type="spellEnd"/>
+            <w:r>
+              <w:rPr>
+                <w:rFonts w:ascii="Calibri" w:eastAsia="Calibri" w:hAnsi="Calibri" w:cs="Calibri"/>
+                <w:color w:val="000000" w:themeColor="text1"/>
+                <w:sz w:val="22"/>
+                <w:szCs w:val="22"/>
+              </w:rPr>
+              <w:t xml:space="preserve"> o </w:t>
+            </w:r>
+            <w:proofErr w:type="spellStart"/>
+            <w:r>
+              <w:rPr>
+                <w:rFonts w:ascii="Calibri" w:eastAsia="Calibri" w:hAnsi="Calibri" w:cs="Calibri"/>
+                <w:color w:val="000000" w:themeColor="text1"/>
+                <w:sz w:val="22"/>
+                <w:szCs w:val="22"/>
+              </w:rPr>
+              <w:t>calibri</w:t>
+            </w:r>
+            <w:proofErr w:type="spellEnd"/>
           </w:p>
           <w:p>
             <w:pPr>
@@ -7619,7 +7676,27 @@
           <w:color w:val="262626"/>
           <w:sz w:val="22"/>
         </w:rPr>
-        <w:t>Proyecto SalonTech: sistema de gestión para peluquerías</w:t>
+        <w:t xml:space="preserve">Proyecto </w:t>
+      </w:r>
+      <w:proofErr w:type="spellStart"/>
+      <w:r>
+        <w:rPr>
+          <w:rFonts w:ascii="Arial" w:eastAsia="Arial" w:hAnsi="Arial" w:cs="Arial"/>
+          <w:i/>
+          <w:color w:val="262626"/>
+          <w:sz w:val="22"/>
+        </w:rPr>
+        <w:t>SalonTech</w:t>
+      </w:r>
+      <w:proofErr w:type="spellEnd"/>
+      <w:r>
+        <w:rPr>
+          <w:rFonts w:ascii="Arial" w:eastAsia="Arial" w:hAnsi="Arial" w:cs="Arial"/>
+          <w:i/>
+          <w:color w:val="262626"/>
+          <w:sz w:val="22"/>
+        </w:rPr>
+        <w:t>: sistema de gestión para peluquerías</w:t>
       </w:r>
     </w:p>
     <w:p>
@@ -7799,12 +7876,21 @@
             <w:vAlign w:val="center"/>
           </w:tcPr>
           <w:p>
+            <w:proofErr w:type="spellStart"/>
             <w:r>
               <w:rPr>
                 <w:rFonts w:ascii="Arial" w:eastAsia="Arial" w:hAnsi="Arial" w:cs="Arial"/>
                 <w:color w:val="262626"/>
               </w:rPr>
-              <w:t>Capstone (PTY4614) · Sección 010V</w:t>
+              <w:t>Capstone</w:t>
+            </w:r>
+            <w:proofErr w:type="spellEnd"/>
+            <w:r>
+              <w:rPr>
+                <w:rFonts w:ascii="Arial" w:eastAsia="Arial" w:hAnsi="Arial" w:cs="Arial"/>
+                <w:color w:val="262626"/>
+              </w:rPr>
+              <w:t xml:space="preserve"> (PTY4614) · Sección 010V</w:t>
             </w:r>
           </w:p>
         </w:tc>
@@ -7841,7 +7927,23 @@
                 <w:rFonts w:ascii="Arial" w:eastAsia="Arial" w:hAnsi="Arial" w:cs="Arial"/>
                 <w:color w:val="262626"/>
               </w:rPr>
-              <w:t>Jefe de proyecto y Product Owner</w:t>
+              <w:t xml:space="preserve">Jefe de proyecto y </w:t>
+            </w:r>
+            <w:proofErr w:type="spellStart"/>
+            <w:r>
+              <w:rPr>
+                <w:rFonts w:ascii="Arial" w:eastAsia="Arial" w:hAnsi="Arial" w:cs="Arial"/>
+                <w:color w:val="262626"/>
+              </w:rPr>
+              <w:t>Product</w:t>
+            </w:r>
+            <w:proofErr w:type="spellEnd"/>
+            <w:r>
+              <w:rPr>
+                <w:rFonts w:ascii="Arial" w:eastAsia="Arial" w:hAnsi="Arial" w:cs="Arial"/>
+                <w:color w:val="262626"/>
+              </w:rPr>
+              <w:t xml:space="preserve"> Owner</w:t>
             </w:r>
           </w:p>
         </w:tc>
@@ -8645,202 +8747,6 @@
           <w:fldChar w:fldCharType="end"/>
         </w:r>
       </w:hyperlink>
-    </w:p>
-    <w:p>
-      <w:pPr>
-        <w:pStyle w:val="TDC11"/>
-        <w:tabs>
-          <w:tab w:val="right" w:leader="dot" w:pos="9394"/>
-        </w:tabs>
-        <w:spacing w:before="80" w:after="40"/>
-      </w:pPr>
-      <w:hyperlink w:anchor="_Toc2026101007" w:history="1">
-        <w:r>
-          <w:rPr>
-            <w:rFonts w:ascii="Arial" w:eastAsia="Arial" w:hAnsi="Arial" w:cs="Arial"/>
-            <w:b/>
-            <w:noProof/>
-            <w:color w:val="262626"/>
-            <w:sz w:val="21"/>
-            <w:szCs w:val="21"/>
-          </w:rPr>
-          <w:t>4. REFLECTION</w:t>
-        </w:r>
-        <w:r>
-          <w:rPr>
-            <w:rFonts w:ascii="Arial" w:eastAsia="Arial" w:hAnsi="Arial" w:cs="Arial"/>
-            <w:b/>
-            <w:noProof/>
-            <w:color w:val="262626"/>
-            <w:sz w:val="21"/>
-            <w:szCs w:val="21"/>
-          </w:rPr>
-          <w:tab/>
-        </w:r>
-        <w:r>
-          <w:rPr>
-            <w:rFonts w:ascii="Arial" w:eastAsia="Arial" w:hAnsi="Arial" w:cs="Arial"/>
-            <w:b/>
-            <w:noProof/>
-            <w:color w:val="262626"/>
-            <w:sz w:val="21"/>
-            <w:szCs w:val="21"/>
-          </w:rPr>
-          <w:fldChar w:fldCharType="begin"/>
-        </w:r>
-        <w:r>
-          <w:rPr>
-            <w:rFonts w:ascii="Arial" w:eastAsia="Arial" w:hAnsi="Arial" w:cs="Arial"/>
-            <w:b/>
-            <w:noProof/>
-            <w:color w:val="262626"/>
-            <w:sz w:val="21"/>
-            <w:szCs w:val="21"/>
-          </w:rPr>
-          <w:instrText xml:space="preserve"> PAGEREF _Toc2026101007 \h </w:instrText>
-        </w:r>
-        <w:r>
-          <w:rPr>
-            <w:rFonts w:ascii="Arial" w:eastAsia="Arial" w:hAnsi="Arial" w:cs="Arial"/>
-            <w:b/>
-            <w:noProof/>
-            <w:color w:val="262626"/>
-            <w:sz w:val="21"/>
-            <w:szCs w:val="21"/>
-          </w:rPr>
-        </w:r>
-        <w:r>
-          <w:rPr>
-            <w:rFonts w:ascii="Arial" w:eastAsia="Arial" w:hAnsi="Arial" w:cs="Arial"/>
-            <w:b/>
-            <w:noProof/>
-            <w:color w:val="262626"/>
-            <w:sz w:val="21"/>
-            <w:szCs w:val="21"/>
-          </w:rPr>
-          <w:fldChar w:fldCharType="separate"/>
-        </w:r>
-        <w:r>
-          <w:rPr>
-            <w:rFonts w:ascii="Arial" w:eastAsia="Arial" w:hAnsi="Arial" w:cs="Arial"/>
-            <w:b/>
-            <w:noProof/>
-            <w:color w:val="262626"/>
-            <w:sz w:val="21"/>
-            <w:szCs w:val="21"/>
-          </w:rPr>
-          <w:t>15</w:t>
-        </w:r>
-        <w:r>
-          <w:rPr>
-            <w:rFonts w:ascii="Arial" w:eastAsia="Arial" w:hAnsi="Arial" w:cs="Arial"/>
-            <w:b/>
-            <w:noProof/>
-            <w:color w:val="262626"/>
-            <w:sz w:val="21"/>
-            <w:szCs w:val="21"/>
-          </w:rPr>
-          <w:fldChar w:fldCharType="end"/>
-        </w:r>
-      </w:hyperlink>
-    </w:p>
-    <w:p>
-      <w:pPr>
-        <w:pStyle w:val="TDC11"/>
-        <w:tabs>
-          <w:tab w:val="right" w:leader="dot" w:pos="9394"/>
-        </w:tabs>
-        <w:spacing w:before="80" w:after="40"/>
-      </w:pPr>
-      <w:hyperlink w:anchor="_Toc2026101008" w:history="1">
-        <w:r>
-          <w:rPr>
-            <w:rFonts w:ascii="Arial" w:eastAsia="Arial" w:hAnsi="Arial" w:cs="Arial"/>
-            <w:b/>
-            <w:noProof/>
-            <w:color w:val="262626"/>
-            <w:sz w:val="21"/>
-            <w:szCs w:val="21"/>
-          </w:rPr>
-          <w:t>5. REFERENCIAS</w:t>
-        </w:r>
-        <w:r>
-          <w:rPr>
-            <w:rFonts w:ascii="Arial" w:eastAsia="Arial" w:hAnsi="Arial" w:cs="Arial"/>
-            <w:b/>
-            <w:noProof/>
-            <w:color w:val="262626"/>
-            <w:sz w:val="21"/>
-            <w:szCs w:val="21"/>
-          </w:rPr>
-          <w:tab/>
-        </w:r>
-        <w:r>
-          <w:rPr>
-            <w:rFonts w:ascii="Arial" w:eastAsia="Arial" w:hAnsi="Arial" w:cs="Arial"/>
-            <w:b/>
-            <w:noProof/>
-            <w:color w:val="262626"/>
-            <w:sz w:val="21"/>
-            <w:szCs w:val="21"/>
-          </w:rPr>
-          <w:fldChar w:fldCharType="begin"/>
-        </w:r>
-        <w:r>
-          <w:rPr>
-            <w:rFonts w:ascii="Arial" w:eastAsia="Arial" w:hAnsi="Arial" w:cs="Arial"/>
-            <w:b/>
-            <w:noProof/>
-            <w:color w:val="262626"/>
-            <w:sz w:val="21"/>
-            <w:szCs w:val="21"/>
-          </w:rPr>
-          <w:instrText xml:space="preserve"> PAGEREF _Toc2026101008 \h </w:instrText>
-        </w:r>
-        <w:r>
-          <w:rPr>
-            <w:rFonts w:ascii="Arial" w:eastAsia="Arial" w:hAnsi="Arial" w:cs="Arial"/>
-            <w:b/>
-            <w:noProof/>
-            <w:color w:val="262626"/>
-            <w:sz w:val="21"/>
-            <w:szCs w:val="21"/>
-          </w:rPr>
-        </w:r>
-        <w:r>
-          <w:rPr>
-            <w:rFonts w:ascii="Arial" w:eastAsia="Arial" w:hAnsi="Arial" w:cs="Arial"/>
-            <w:b/>
-            <w:noProof/>
-            <w:color w:val="262626"/>
-            <w:sz w:val="21"/>
-            <w:szCs w:val="21"/>
-          </w:rPr>
-          <w:fldChar w:fldCharType="separate"/>
-        </w:r>
-        <w:r>
-          <w:rPr>
-            <w:rFonts w:ascii="Arial" w:eastAsia="Arial" w:hAnsi="Arial" w:cs="Arial"/>
-            <w:b/>
-            <w:noProof/>
-            <w:color w:val="262626"/>
-            <w:sz w:val="21"/>
-            <w:szCs w:val="21"/>
-          </w:rPr>
-          <w:t>15</w:t>
-        </w:r>
-        <w:r>
-          <w:rPr>
-            <w:rFonts w:ascii="Arial" w:eastAsia="Arial" w:hAnsi="Arial" w:cs="Arial"/>
-            <w:b/>
-            <w:noProof/>
-            <w:color w:val="262626"/>
-            <w:sz w:val="21"/>
-            <w:szCs w:val="21"/>
-          </w:rPr>
-          <w:fldChar w:fldCharType="end"/>
-        </w:r>
-      </w:hyperlink>
       <w:r>
         <w:rPr>
           <w:rFonts w:ascii="Arial" w:eastAsia="Arial" w:hAnsi="Arial" w:cs="Arial"/>
@@ -8851,11 +8757,6 @@
         </w:rPr>
         <w:fldChar w:fldCharType="end"/>
       </w:r>
-    </w:p>
-    <w:p>
-      <w:pPr>
-        <w:jc w:val="both"/>
-      </w:pPr>
       <w:r>
         <w:br w:type="page"/>
       </w:r>
@@ -9081,7 +8982,25 @@
                 <w:color w:val="262626"/>
                 <w:sz w:val="19"/>
               </w:rPr>
-              <w:t>Apliqué Scrum con sprints semanales, acepté cada incremento en su revisión y se cumplió el objetivo 5, pero como jefe de proyecto no aseguré que el tablero estuviera al día.</w:t>
+              <w:t xml:space="preserve">Apliqué Scrum con </w:t>
+            </w:r>
+            <w:proofErr w:type="spellStart"/>
+            <w:r>
+              <w:rPr>
+                <w:rFonts w:ascii="Arial" w:eastAsia="Arial" w:hAnsi="Arial" w:cs="Arial"/>
+                <w:color w:val="262626"/>
+                <w:sz w:val="19"/>
+              </w:rPr>
+              <w:t>sprints</w:t>
+            </w:r>
+            <w:proofErr w:type="spellEnd"/>
+            <w:r>
+              <w:rPr>
+                <w:rFonts w:ascii="Arial" w:eastAsia="Arial" w:hAnsi="Arial" w:cs="Arial"/>
+                <w:color w:val="262626"/>
+                <w:sz w:val="19"/>
+              </w:rPr>
+              <w:t xml:space="preserve"> semanales, acepté cada incremento en su revisión y se cumplió el objetivo 5, pero como jefe de proyecto no aseguré que el tablero estuviera al día.</w:t>
             </w:r>
           </w:p>
         </w:tc>
@@ -9136,7 +9055,25 @@
                 <w:color w:val="262626"/>
                 <w:sz w:val="19"/>
               </w:rPr>
-              <w:t>Presento los PR de mis sprints, 100 pruebas automatizadas de mi parte y una demostración de una reserva con abono de punta a punta.</w:t>
+              <w:t xml:space="preserve">Presento los PR de mis </w:t>
+            </w:r>
+            <w:proofErr w:type="spellStart"/>
+            <w:r>
+              <w:rPr>
+                <w:rFonts w:ascii="Arial" w:eastAsia="Arial" w:hAnsi="Arial" w:cs="Arial"/>
+                <w:color w:val="262626"/>
+                <w:sz w:val="19"/>
+              </w:rPr>
+              <w:t>sprints</w:t>
+            </w:r>
+            <w:proofErr w:type="spellEnd"/>
+            <w:r>
+              <w:rPr>
+                <w:rFonts w:ascii="Arial" w:eastAsia="Arial" w:hAnsi="Arial" w:cs="Arial"/>
+                <w:color w:val="262626"/>
+                <w:sz w:val="19"/>
+              </w:rPr>
+              <w:t>, 100 pruebas automatizadas de mi parte y una demostración de una reserva con abono de punta a punta.</w:t>
             </w:r>
           </w:p>
         </w:tc>
@@ -9301,7 +9238,25 @@
                 <w:color w:val="262626"/>
                 <w:sz w:val="19"/>
               </w:rPr>
-              <w:t>Tiene portada, índice, resumen, abstract, desarrollo, conclusión, reflexión, referencias y número de página.</w:t>
+              <w:t xml:space="preserve">Tiene portada, índice, resumen, </w:t>
+            </w:r>
+            <w:proofErr w:type="spellStart"/>
+            <w:r>
+              <w:rPr>
+                <w:rFonts w:ascii="Arial" w:eastAsia="Arial" w:hAnsi="Arial" w:cs="Arial"/>
+                <w:color w:val="262626"/>
+                <w:sz w:val="19"/>
+              </w:rPr>
+              <w:t>abstract</w:t>
+            </w:r>
+            <w:proofErr w:type="spellEnd"/>
+            <w:r>
+              <w:rPr>
+                <w:rFonts w:ascii="Arial" w:eastAsia="Arial" w:hAnsi="Arial" w:cs="Arial"/>
+                <w:color w:val="262626"/>
+                <w:sz w:val="19"/>
+              </w:rPr>
+              <w:t>, desarrollo, conclusión, reflexión, referencias y número de página.</w:t>
             </w:r>
           </w:p>
         </w:tc>
@@ -9455,7 +9410,43 @@
           <w:color w:val="262626"/>
           <w:sz w:val="22"/>
         </w:rPr>
-        <w:t>Este informe presenta mi avance individual en SalonTech, el sistema web de gestión que desarrollamos con Hanns Stack y José Salinas para un salón de extensiones y color de Padre Hurtado. Como jefe de proyecto y Product Owner, soy el canal con la clienta y con el docente, priorizo los requisitos y acepto cada incremento; además, tengo a cargo la reserva en línea, las atenciones y las ventas. Esa parte funciona de punta a punta y se amplió con el abono en línea mediante Webpay Plus. Según la ficha de avance 04, el proyecto tiene un 80 % reconocido de la versión 1.0, frente al 85 % que estimábamos. Quedan pendientes la caja del día con su comprobante, el tablero de requisitos y la validación con la clienta sobre el sistema publicado.</w:t>
+        <w:t xml:space="preserve">Este informe presenta mi avance individual en </w:t>
+      </w:r>
+      <w:proofErr w:type="spellStart"/>
+      <w:r>
+        <w:rPr>
+          <w:rFonts w:ascii="Arial" w:eastAsia="Arial" w:hAnsi="Arial" w:cs="Arial"/>
+          <w:color w:val="262626"/>
+          <w:sz w:val="22"/>
+        </w:rPr>
+        <w:t>SalonTech</w:t>
+      </w:r>
+      <w:proofErr w:type="spellEnd"/>
+      <w:r>
+        <w:rPr>
+          <w:rFonts w:ascii="Arial" w:eastAsia="Arial" w:hAnsi="Arial" w:cs="Arial"/>
+          <w:color w:val="262626"/>
+          <w:sz w:val="22"/>
+        </w:rPr>
+        <w:t xml:space="preserve">, el sistema web de gestión que desarrollamos con Hanns Stack y José Salinas para un salón de extensiones y color de Padre Hurtado. Como jefe de proyecto y </w:t>
+      </w:r>
+      <w:proofErr w:type="spellStart"/>
+      <w:r>
+        <w:rPr>
+          <w:rFonts w:ascii="Arial" w:eastAsia="Arial" w:hAnsi="Arial" w:cs="Arial"/>
+          <w:color w:val="262626"/>
+          <w:sz w:val="22"/>
+        </w:rPr>
+        <w:t>Product</w:t>
+      </w:r>
+      <w:proofErr w:type="spellEnd"/>
+      <w:r>
+        <w:rPr>
+          <w:rFonts w:ascii="Arial" w:eastAsia="Arial" w:hAnsi="Arial" w:cs="Arial"/>
+          <w:color w:val="262626"/>
+          <w:sz w:val="22"/>
+        </w:rPr>
+        <w:t xml:space="preserve"> Owner, soy el canal con la clienta y con el docente, priorizo los requisitos y acepto cada incremento; además, tengo a cargo la reserva en línea, las atenciones y las ventas. Esa parte funciona de punta a punta y se amplió con el abono en línea mediante Webpay Plus. Según la ficha de avance 04, el proyecto tiene un 80 % reconocido de la versión 1.0, frente al 85 % que estimábamos. Quedan pendientes la caja del día con su comprobante, el tablero de requisitos y la validación con la clienta sobre el sistema publicado.</w:t>
       </w:r>
     </w:p>
     <w:p>
@@ -9492,7 +9483,47 @@
           <w:sz w:val="22"/>
           <w:lang w:val="en-US"/>
         </w:rPr>
-        <w:t>This report presents my individual progress on SalonTech, the web management system that Hanns Stack, José Salinas and I are building for a hair extension and color salon in Padre Hurtado. As project manager and Product Owner, I am the contact with the client and the professor, I prioritize the requirements and I accept each increment; I am also responsible for online booking, services and sales. That part works from end to end and was extended with an online deposit through Webpay Plus. According to progress sheet 04, the project has reached 80% of version 1.0, while we had estimated 85%. The daily cash register with its receipt, the requirements board and the validation with the client on the deployed system are still pending.</w:t>
+        <w:t xml:space="preserve">This report presents my individual progress on </w:t>
+      </w:r>
+      <w:proofErr w:type="spellStart"/>
+      <w:r>
+        <w:rPr>
+          <w:rFonts w:ascii="Arial" w:eastAsia="Arial" w:hAnsi="Arial" w:cs="Arial"/>
+          <w:color w:val="262626"/>
+          <w:sz w:val="22"/>
+          <w:lang w:val="en-US"/>
+        </w:rPr>
+        <w:t>SalonTech</w:t>
+      </w:r>
+      <w:proofErr w:type="spellEnd"/>
+      <w:r>
+        <w:rPr>
+          <w:rFonts w:ascii="Arial" w:eastAsia="Arial" w:hAnsi="Arial" w:cs="Arial"/>
+          <w:color w:val="262626"/>
+          <w:sz w:val="22"/>
+          <w:lang w:val="en-US"/>
+        </w:rPr>
+        <w:t xml:space="preserve">, the web management system that Hanns Stack, José Salinas and I are building for a hair extension and color salon in Padre Hurtado. As project manager and Product Owner, I am the contact with the client and the professor, I prioritize the requirements and I accept each increment; I am also responsible for online booking, services and sales. That part works from end to end and was extended with an online deposit through </w:t>
+      </w:r>
+      <w:proofErr w:type="spellStart"/>
+      <w:r>
+        <w:rPr>
+          <w:rFonts w:ascii="Arial" w:eastAsia="Arial" w:hAnsi="Arial" w:cs="Arial"/>
+          <w:color w:val="262626"/>
+          <w:sz w:val="22"/>
+          <w:lang w:val="en-US"/>
+        </w:rPr>
+        <w:t>Webpay</w:t>
+      </w:r>
+      <w:proofErr w:type="spellEnd"/>
+      <w:r>
+        <w:rPr>
+          <w:rFonts w:ascii="Arial" w:eastAsia="Arial" w:hAnsi="Arial" w:cs="Arial"/>
+          <w:color w:val="262626"/>
+          <w:sz w:val="22"/>
+          <w:lang w:val="en-US"/>
+        </w:rPr>
+        <w:t xml:space="preserve"> Plus. According to progress sheet 04, the project has reached 80% of version 1.0, while we had estimated 85%. The daily cash register with its receipt, the requirements board and the validation with the client on the deployed system are still pending.</w:t>
       </w:r>
     </w:p>
     <w:p>
@@ -9551,7 +9582,7 @@
           <w:color w:val="262626"/>
           <w:sz w:val="22"/>
         </w:rPr>
-        <w:t>Reserva en línea (extensión 5).</w:t>
+        <w:t>Reserva en línea.</w:t>
       </w:r>
       <w:r>
         <w:rPr>
@@ -9559,7 +9590,7 @@
           <w:color w:val="262626"/>
           <w:sz w:val="22"/>
         </w:rPr>
-        <w:t xml:space="preserve"> La clienta entra a la página del salón, elige servicio, profesional y una hora entre las que el motor de agenda deja libres, y paga el abono con Webpay Plus (Transbank, s. f.). Mientras paga, la hora queda guardada unos minutos; si no paga a tiempo, se libera sola. La confirmación cuenta una sola vez aunque Transbank la informe dos veces, y si la clienta cancela a tiempo recupera todo su abono; si cancela tarde, el salón define si queda como crédito o si se devuelve una parte.</w:t>
+        <w:t xml:space="preserve"> La clienta entra a la página del salón, elige servicio, profesional y una hora entre las que el motor de agenda deja libres, y paga el abono con Webpay Plus (Transbank). Mientras paga, la hora queda guardada unos minutos; si no paga a tiempo, se libera sola. La confirmación cuenta una sola vez aunque Transbank la informe dos veces, y si la clienta cancela a tiempo recupera todo su abono; si cancela tarde, el salón define si queda como crédito o si se devuelve una parte.</w:t>
       </w:r>
     </w:p>
     <w:p>
@@ -9578,7 +9609,7 @@
           <w:color w:val="262626"/>
           <w:sz w:val="22"/>
         </w:rPr>
-        <w:t>Atenciones y ventas (objetivo 5).</w:t>
+        <w:t>Atenciones y ventas.</w:t>
       </w:r>
       <w:r>
         <w:rPr>
@@ -9613,7 +9644,25 @@
           <w:color w:val="262626"/>
           <w:sz w:val="22"/>
         </w:rPr>
-        <w:t xml:space="preserve"> Prioricé el backlog, con 86 requisitos de núcleo y 37 extensiones en orden, y acepté o rechacé cada incremento según su criterio de aceptación, que es la forma de validar que un requisito se cumple (Sommerville, 2016). Trabajamos con sprints de una semana y revisión del incremento al final de cada uno (Schwaber y Sutherland, 2020). Cuando el docente pidió ver los roles y la página pública para el 16 de septiembre, el adelanto quedó registrado como decisión, con su fecha y su motivo.</w:t>
+        <w:t xml:space="preserve"> Prioricé el backlog, con 86 requisitos de núcleo y 37 extensiones en orden, y acepté o rechacé cada incremento según su criterio de aceptación, que es la forma de validar que un requisito se cumple. Trabajamos con </w:t>
+      </w:r>
+      <w:proofErr w:type="spellStart"/>
+      <w:r>
+        <w:rPr>
+          <w:rFonts w:ascii="Arial" w:eastAsia="Arial" w:hAnsi="Arial" w:cs="Arial"/>
+          <w:color w:val="262626"/>
+          <w:sz w:val="22"/>
+        </w:rPr>
+        <w:t>sprints</w:t>
+      </w:r>
+      <w:proofErr w:type="spellEnd"/>
+      <w:r>
+        <w:rPr>
+          <w:rFonts w:ascii="Arial" w:eastAsia="Arial" w:hAnsi="Arial" w:cs="Arial"/>
+          <w:color w:val="262626"/>
+          <w:sz w:val="22"/>
+        </w:rPr>
+        <w:t xml:space="preserve"> de una semana y revisión del incremento al final de cada uno.</w:t>
       </w:r>
     </w:p>
     <w:p>
@@ -9786,7 +9835,7 @@
                 <w:color w:val="262626"/>
                 <w:sz w:val="19"/>
               </w:rPr>
-              <w:t>La página pública y las vistas por rol se adelantaron dos semanas.</w:t>
+              <w:t>El abono en línea entró como extensión.</w:t>
             </w:r>
           </w:p>
         </w:tc>
@@ -9802,118 +9851,7 @@
                 <w:color w:val="262626"/>
                 <w:sz w:val="19"/>
               </w:rPr>
-              <w:t>Retroalimentación: el docente pidió verlas en la revisión del 16 de septiembre. Cupo porque el proyecto iba dos sprints adelantado.</w:t>
-            </w:r>
-          </w:p>
-        </w:tc>
-      </w:tr>
-      <w:tr>
-        <w:trPr>
-          <w:cantSplit/>
-        </w:trPr>
-        <w:tc>
-          <w:tcPr>
-            <w:tcW w:w="3500" w:type="dxa"/>
-            <w:vAlign w:val="center"/>
-          </w:tcPr>
-          <w:p>
-            <w:r>
-              <w:rPr>
-                <w:rFonts w:ascii="Arial" w:eastAsia="Arial" w:hAnsi="Arial" w:cs="Arial"/>
-                <w:color w:val="262626"/>
-                <w:sz w:val="19"/>
-              </w:rPr>
-              <w:t>El abono en línea entró como extensión.</w:t>
-            </w:r>
-          </w:p>
-        </w:tc>
-        <w:tc>
-          <w:tcPr>
-            <w:tcW w:w="5904" w:type="dxa"/>
-            <w:vAlign w:val="center"/>
-          </w:tcPr>
-          <w:p>
-            <w:r>
-              <w:rPr>
-                <w:rFonts w:ascii="Arial" w:eastAsia="Arial" w:hAnsi="Arial" w:cs="Arial"/>
-                <w:color w:val="262626"/>
-                <w:sz w:val="19"/>
-              </w:rPr>
               <w:t>Facilitador: el núcleo terminó antes de su fecha prevista.</w:t>
-            </w:r>
-          </w:p>
-        </w:tc>
-      </w:tr>
-      <w:tr>
-        <w:trPr>
-          <w:cantSplit/>
-        </w:trPr>
-        <w:tc>
-          <w:tcPr>
-            <w:tcW w:w="3500" w:type="dxa"/>
-            <w:vAlign w:val="center"/>
-          </w:tcPr>
-          <w:p>
-            <w:r>
-              <w:rPr>
-                <w:rFonts w:ascii="Arial" w:eastAsia="Arial" w:hAnsi="Arial" w:cs="Arial"/>
-                <w:color w:val="262626"/>
-                <w:sz w:val="19"/>
-              </w:rPr>
-              <w:t>Cobrar abonos reales queda fuera de la versión 1.0.</w:t>
-            </w:r>
-          </w:p>
-        </w:tc>
-        <w:tc>
-          <w:tcPr>
-            <w:tcW w:w="5904" w:type="dxa"/>
-            <w:vAlign w:val="center"/>
-          </w:tcPr>
-          <w:p>
-            <w:r>
-              <w:rPr>
-                <w:rFonts w:ascii="Arial" w:eastAsia="Arial" w:hAnsi="Arial" w:cs="Arial"/>
-                <w:color w:val="262626"/>
-                <w:sz w:val="19"/>
-              </w:rPr>
-              <w:t>Dificultad: depende de que la clienta se afilie a Transbank; el flujo queda probado en el ambiente de integración.</w:t>
-            </w:r>
-          </w:p>
-        </w:tc>
-      </w:tr>
-      <w:tr>
-        <w:trPr>
-          <w:cantSplit/>
-        </w:trPr>
-        <w:tc>
-          <w:tcPr>
-            <w:tcW w:w="3500" w:type="dxa"/>
-            <w:vAlign w:val="center"/>
-          </w:tcPr>
-          <w:p>
-            <w:r>
-              <w:rPr>
-                <w:rFonts w:ascii="Arial" w:eastAsia="Arial" w:hAnsi="Arial" w:cs="Arial"/>
-                <w:color w:val="262626"/>
-                <w:sz w:val="19"/>
-              </w:rPr>
-              <w:t>El alcance se congela el 18 de octubre.</w:t>
-            </w:r>
-          </w:p>
-        </w:tc>
-        <w:tc>
-          <w:tcPr>
-            <w:tcW w:w="5904" w:type="dxa"/>
-            <w:vAlign w:val="center"/>
-          </w:tcPr>
-          <w:p>
-            <w:r>
-              <w:rPr>
-                <w:rFonts w:ascii="Arial" w:eastAsia="Arial" w:hAnsi="Arial" w:cs="Arial"/>
-                <w:color w:val="262626"/>
-                <w:sz w:val="19"/>
-              </w:rPr>
-              <w:t>Es mi meta de la fase 1: no aceptar funcionalidades nuevas después de esa fecha. Lo que no esté listo se declara trabajo futuro, con su justificación.</w:t>
             </w:r>
           </w:p>
         </w:tc>
@@ -10031,7 +9969,7 @@
                 <w:color w:val="262626"/>
                 <w:sz w:val="19"/>
               </w:rPr>
-              <w:t>PR de los sprints 6 y 9: reserva en línea, atenciones, ventas y abono en línea.</w:t>
+              <w:t>Demostración en vivo.</w:t>
             </w:r>
           </w:p>
         </w:tc>
@@ -10047,7 +9985,7 @@
                 <w:color w:val="262626"/>
                 <w:sz w:val="19"/>
               </w:rPr>
-              <w:t>El trabajo realizado, con revisión entre pares antes de integrar.</w:t>
+              <w:t>Reservar desde la página pública, pagar el abono en el ambiente de pruebas de Transbank, ver la cita confirmada en la agenda y cobrar la atención descontando el abono.</w:t>
             </w:r>
           </w:p>
         </w:tc>
@@ -10068,7 +10006,7 @@
                 <w:color w:val="262626"/>
                 <w:sz w:val="19"/>
               </w:rPr>
-              <w:t>100 pruebas automatizadas: abono en línea (61), atenciones (19), página pública (11) y reserva en línea (9), dentro de las 437 del backend.</w:t>
+              <w:t>Registro de la decisión de la pasarela de pago.</w:t>
             </w:r>
           </w:p>
         </w:tc>
@@ -10084,124 +10022,102 @@
                 <w:color w:val="262626"/>
                 <w:sz w:val="19"/>
               </w:rPr>
-              <w:t>Que las reglas de la reserva, del cobro y del abono se cumplen, incluidos los cortes de red simulados.</w:t>
-            </w:r>
-          </w:p>
-        </w:tc>
-      </w:tr>
-      <w:tr>
-        <w:trPr>
-          <w:cantSplit/>
-        </w:trPr>
-        <w:tc>
-          <w:tcPr>
-            <w:tcW w:w="3500" w:type="dxa"/>
-            <w:vAlign w:val="center"/>
-          </w:tcPr>
-          <w:p>
-            <w:r>
-              <w:rPr>
-                <w:rFonts w:ascii="Arial" w:eastAsia="Arial" w:hAnsi="Arial" w:cs="Arial"/>
-                <w:color w:val="262626"/>
-                <w:sz w:val="19"/>
-              </w:rPr>
-              <w:lastRenderedPageBreak/>
-              <w:t>Guiones de prueba manual de los sprints 6 y 9.</w:t>
-            </w:r>
-          </w:p>
-        </w:tc>
-        <w:tc>
-          <w:tcPr>
-            <w:tcW w:w="5904" w:type="dxa"/>
-            <w:vAlign w:val="center"/>
-          </w:tcPr>
-          <w:p>
-            <w:r>
-              <w:rPr>
-                <w:rFonts w:ascii="Arial" w:eastAsia="Arial" w:hAnsi="Arial" w:cs="Arial"/>
-                <w:color w:val="262626"/>
-                <w:sz w:val="19"/>
-              </w:rPr>
-              <w:t>Que cada incremento se revisó paso a paso en pantalla antes de aceptarlo.</w:t>
-            </w:r>
-          </w:p>
-        </w:tc>
-      </w:tr>
-      <w:tr>
-        <w:trPr>
-          <w:cantSplit/>
-        </w:trPr>
-        <w:tc>
-          <w:tcPr>
-            <w:tcW w:w="3500" w:type="dxa"/>
-            <w:vAlign w:val="center"/>
-          </w:tcPr>
-          <w:p>
-            <w:r>
-              <w:rPr>
-                <w:rFonts w:ascii="Arial" w:eastAsia="Arial" w:hAnsi="Arial" w:cs="Arial"/>
-                <w:color w:val="262626"/>
-                <w:sz w:val="19"/>
-              </w:rPr>
-              <w:t>Demostración en vivo.</w:t>
-            </w:r>
-          </w:p>
-        </w:tc>
-        <w:tc>
-          <w:tcPr>
-            <w:tcW w:w="5904" w:type="dxa"/>
-            <w:vAlign w:val="center"/>
-          </w:tcPr>
-          <w:p>
-            <w:r>
-              <w:rPr>
-                <w:rFonts w:ascii="Arial" w:eastAsia="Arial" w:hAnsi="Arial" w:cs="Arial"/>
-                <w:color w:val="262626"/>
-                <w:sz w:val="19"/>
-              </w:rPr>
-              <w:t>Reservar desde la página pública, pagar el abono en el ambiente de pruebas de Transbank, ver la cita confirmada en la agenda y cobrar la atención descontando el abono.</w:t>
-            </w:r>
-          </w:p>
-        </w:tc>
-      </w:tr>
-      <w:tr>
-        <w:trPr>
-          <w:cantSplit/>
-        </w:trPr>
-        <w:tc>
-          <w:tcPr>
-            <w:tcW w:w="3500" w:type="dxa"/>
-            <w:vAlign w:val="center"/>
-          </w:tcPr>
-          <w:p>
-            <w:r>
-              <w:rPr>
-                <w:rFonts w:ascii="Arial" w:eastAsia="Arial" w:hAnsi="Arial" w:cs="Arial"/>
-                <w:color w:val="262626"/>
-                <w:sz w:val="19"/>
-              </w:rPr>
-              <w:t>Registro de la decisión de la pasarela de pago.</w:t>
-            </w:r>
-          </w:p>
-        </w:tc>
-        <w:tc>
-          <w:tcPr>
-            <w:tcW w:w="5904" w:type="dxa"/>
-            <w:vAlign w:val="center"/>
-          </w:tcPr>
-          <w:p>
-            <w:r>
-              <w:rPr>
-                <w:rFonts w:ascii="Arial" w:eastAsia="Arial" w:hAnsi="Arial" w:cs="Arial"/>
-                <w:color w:val="262626"/>
-                <w:sz w:val="19"/>
-              </w:rPr>
               <w:t>Que el cambio de Mercado Pago a Webpay Plus se justificó con razones y alternativas evaluadas.</w:t>
             </w:r>
           </w:p>
         </w:tc>
       </w:tr>
     </w:tbl>
+    <w:p>
+      <w:pPr>
+        <w:spacing w:line="120" w:lineRule="exact"/>
+        <w:jc w:val="both"/>
+      </w:pPr>
+    </w:p>
+    <w:p>
+      <w:pPr>
+        <w:spacing w:line="120" w:lineRule="exact"/>
+        <w:jc w:val="both"/>
+      </w:pPr>
+    </w:p>
+    <w:p>
+      <w:pPr>
+        <w:spacing w:line="120" w:lineRule="exact"/>
+        <w:jc w:val="both"/>
+      </w:pPr>
+    </w:p>
+    <w:p>
+      <w:pPr>
+        <w:spacing w:line="120" w:lineRule="exact"/>
+        <w:jc w:val="both"/>
+      </w:pPr>
+    </w:p>
+    <w:p>
+      <w:pPr>
+        <w:spacing w:line="120" w:lineRule="exact"/>
+        <w:jc w:val="both"/>
+      </w:pPr>
+    </w:p>
+    <w:p>
+      <w:pPr>
+        <w:spacing w:line="120" w:lineRule="exact"/>
+        <w:jc w:val="both"/>
+      </w:pPr>
+    </w:p>
+    <w:p>
+      <w:pPr>
+        <w:spacing w:line="120" w:lineRule="exact"/>
+        <w:jc w:val="both"/>
+      </w:pPr>
+    </w:p>
+    <w:p>
+      <w:pPr>
+        <w:spacing w:line="120" w:lineRule="exact"/>
+        <w:jc w:val="both"/>
+      </w:pPr>
+    </w:p>
+    <w:p>
+      <w:pPr>
+        <w:spacing w:line="120" w:lineRule="exact"/>
+        <w:jc w:val="both"/>
+      </w:pPr>
+    </w:p>
+    <w:p>
+      <w:pPr>
+        <w:spacing w:line="120" w:lineRule="exact"/>
+        <w:jc w:val="both"/>
+      </w:pPr>
+    </w:p>
+    <w:p>
+      <w:pPr>
+        <w:spacing w:line="120" w:lineRule="exact"/>
+        <w:jc w:val="both"/>
+      </w:pPr>
+    </w:p>
+    <w:p>
+      <w:pPr>
+        <w:spacing w:line="120" w:lineRule="exact"/>
+        <w:jc w:val="both"/>
+      </w:pPr>
+    </w:p>
+    <w:p>
+      <w:pPr>
+        <w:spacing w:line="120" w:lineRule="exact"/>
+        <w:jc w:val="both"/>
+      </w:pPr>
+    </w:p>
+    <w:p>
+      <w:pPr>
+        <w:spacing w:line="120" w:lineRule="exact"/>
+        <w:jc w:val="both"/>
+      </w:pPr>
+    </w:p>
+    <w:p>
+      <w:pPr>
+        <w:spacing w:line="120" w:lineRule="exact"/>
+        <w:jc w:val="both"/>
+      </w:pPr>
+    </w:p>
     <w:p>
       <w:pPr>
         <w:spacing w:line="120" w:lineRule="exact"/>
@@ -10229,18 +10145,27 @@
           <w:sz w:val="26"/>
           <w:lang w:val="en-US"/>
         </w:rPr>
+        <w:lastRenderedPageBreak/>
         <w:t>3. CONCLUSION</w:t>
       </w:r>
       <w:bookmarkEnd w:id="6"/>
     </w:p>
     <w:p>
       <w:pPr>
-        <w:spacing w:after="120"/>
-        <w:jc w:val="both"/>
+        <w:pStyle w:val="Ttulo11"/>
+        <w:keepNext/>
+        <w:pBdr>
+          <w:bottom w:val="single" w:sz="6" w:space="1" w:color="8EAADB"/>
+        </w:pBdr>
+        <w:spacing w:before="280" w:after="120"/>
         <w:rPr>
+          <w:rFonts w:ascii="Arial" w:eastAsia="Arial" w:hAnsi="Arial" w:cs="Arial"/>
+          <w:color w:val="262626"/>
+          <w:sz w:val="22"/>
           <w:lang w:val="en-US"/>
         </w:rPr>
       </w:pPr>
+      <w:bookmarkStart w:id="7" w:name="_Toc2026101007"/>
       <w:r>
         <w:rPr>
           <w:rFonts w:ascii="Arial" w:eastAsia="Arial" w:hAnsi="Arial" w:cs="Arial"/>
@@ -10248,7 +10173,27 @@
           <w:sz w:val="22"/>
           <w:lang w:val="en-US"/>
         </w:rPr>
-        <w:t>This phase showed me that building fast is not the same as finishing. My part, online booking, services and sales, works from end to end and now includes the deposit with Webpay Plus, but our first estimate was 85% and the traceability showed 80%. Being the only contact with the client and the professor taught me to write down every decision: changing the payment gateway was easy to justify because the reasons were already documented. Security was my weakest area in Phase 1, and working with online payments forced me to learn it in practice, with confirmations that count only once, payments in doubt and refunds. I also failed at one part of my role: the access module was accepted as done without checking each requirement, and three critical requirements stayed hidden for two sprints. My goal for the last weeks is to respect the October 18 freeze and to finish the cash register and the PDF receipt with José.</w:t>
+        <w:t xml:space="preserve">This phase showed me that building fast is not the same as finishing. My part, online booking, services and sales, works from end to end and now includes the deposit with </w:t>
+      </w:r>
+      <w:proofErr w:type="spellStart"/>
+      <w:r>
+        <w:rPr>
+          <w:rFonts w:ascii="Arial" w:eastAsia="Arial" w:hAnsi="Arial" w:cs="Arial"/>
+          <w:color w:val="262626"/>
+          <w:sz w:val="22"/>
+          <w:lang w:val="en-US"/>
+        </w:rPr>
+        <w:t>Webpay</w:t>
+      </w:r>
+      <w:proofErr w:type="spellEnd"/>
+      <w:r>
+        <w:rPr>
+          <w:rFonts w:ascii="Arial" w:eastAsia="Arial" w:hAnsi="Arial" w:cs="Arial"/>
+          <w:color w:val="262626"/>
+          <w:sz w:val="22"/>
+          <w:lang w:val="en-US"/>
+        </w:rPr>
+        <w:t xml:space="preserve"> Plus. Being the only contact with the client and the professor taught me to write down every decision: changing the payment gateway was easy to justify because the reasons were already documented. Security was my weakest area in Phase 1, I also failed at one part of my role: the access module was accepted as done without checking each requirement, and three critical requirements stayed hidden for two sprints.</w:t>
       </w:r>
     </w:p>
     <w:p>
@@ -10263,7 +10208,15 @@
           <w:lang w:val="en-US"/>
         </w:rPr>
       </w:pPr>
-      <w:bookmarkStart w:id="7" w:name="_Toc2026101007"/>
+      <w:r>
+        <w:rPr>
+          <w:rFonts w:ascii="Arial" w:eastAsia="Arial" w:hAnsi="Arial" w:cs="Arial"/>
+          <w:color w:val="262626"/>
+          <w:sz w:val="22"/>
+          <w:lang w:val="en-US"/>
+        </w:rPr>
+        <w:t xml:space="preserve"> </w:t>
+      </w:r>
       <w:r>
         <w:rPr>
           <w:rFonts w:ascii="Arial" w:eastAsia="Arial" w:hAnsi="Arial" w:cs="Arial"/>
@@ -10291,133 +10244,7 @@
           <w:sz w:val="22"/>
           <w:lang w:val="en-US"/>
         </w:rPr>
-        <w:t>Looking at the rubric, I think our strongest indicator is the evidence: every feature can be shown working, with tests and a pull request behind it. The weakest one is the formal side of the project. In Phase 1 I said I wanted to improve the documentation, and the system moved faster than the report, so now I have to close that gap. As Product Owner, the hardest part was saying no: there were good ideas that could still fit, but the freeze date exists to protect the time for testing and validation. I also learned that a dependency outside the team can stop a feature in one day, as Mercado Pago did, so now I look for a plan B before choosing a service. If I started this phase again, I would load the requirements board in the first week and review it in every planning meeting.</w:t>
-      </w:r>
-    </w:p>
-    <w:p>
-      <w:pPr>
-        <w:pStyle w:val="Ttulo11"/>
-        <w:keepNext/>
-        <w:pBdr>
-          <w:bottom w:val="single" w:sz="6" w:space="1" w:color="8EAADB"/>
-        </w:pBdr>
-        <w:spacing w:before="280" w:after="120"/>
-      </w:pPr>
-      <w:bookmarkStart w:id="8" w:name="_Toc2026101008"/>
-      <w:r>
-        <w:rPr>
-          <w:rFonts w:ascii="Arial" w:eastAsia="Arial" w:hAnsi="Arial" w:cs="Arial"/>
-          <w:b/>
-          <w:color w:val="1F3864"/>
-          <w:sz w:val="26"/>
-        </w:rPr>
-        <w:t>5. REFERENCIAS</w:t>
-      </w:r>
-      <w:bookmarkEnd w:id="8"/>
-    </w:p>
-    <w:p>
-      <w:pPr>
-        <w:spacing w:after="120"/>
-        <w:ind w:left="560" w:hanging="560"/>
-      </w:pPr>
-      <w:r>
-        <w:rPr>
-          <w:rFonts w:ascii="Arial" w:eastAsia="Arial" w:hAnsi="Arial" w:cs="Arial"/>
-          <w:color w:val="262626"/>
-          <w:sz w:val="22"/>
-        </w:rPr>
-        <w:t xml:space="preserve">Schwaber, K., y Sutherland, J. (2020). </w:t>
-      </w:r>
-      <w:r>
-        <w:rPr>
-          <w:rFonts w:ascii="Arial" w:eastAsia="Arial" w:hAnsi="Arial" w:cs="Arial"/>
-          <w:i/>
-          <w:color w:val="262626"/>
-          <w:sz w:val="22"/>
-        </w:rPr>
-        <w:t>La Guía de Scrum</w:t>
-      </w:r>
-      <w:r>
-        <w:rPr>
-          <w:rFonts w:ascii="Arial" w:eastAsia="Arial" w:hAnsi="Arial" w:cs="Arial"/>
-          <w:color w:val="262626"/>
-          <w:sz w:val="22"/>
-        </w:rPr>
-        <w:t>. https://scrumguides.org/</w:t>
-      </w:r>
-    </w:p>
-    <w:p>
-      <w:pPr>
-        <w:spacing w:after="120"/>
-        <w:ind w:left="560" w:hanging="560"/>
-        <w:rPr>
-          <w:lang w:val="en-US"/>
-        </w:rPr>
-      </w:pPr>
-      <w:r>
-        <w:rPr>
-          <w:rFonts w:ascii="Arial" w:eastAsia="Arial" w:hAnsi="Arial" w:cs="Arial"/>
-          <w:color w:val="262626"/>
-          <w:sz w:val="22"/>
-          <w:lang w:val="en-US"/>
-        </w:rPr>
-        <w:t xml:space="preserve">Sommerville, I. (2016). </w:t>
-      </w:r>
-      <w:r>
-        <w:rPr>
-          <w:rFonts w:ascii="Arial" w:eastAsia="Arial" w:hAnsi="Arial" w:cs="Arial"/>
-          <w:i/>
-          <w:color w:val="262626"/>
-          <w:sz w:val="22"/>
-          <w:lang w:val="en-US"/>
-        </w:rPr>
-        <w:t>Software engineering</w:t>
-      </w:r>
-      <w:r>
-        <w:rPr>
-          <w:rFonts w:ascii="Arial" w:eastAsia="Arial" w:hAnsi="Arial" w:cs="Arial"/>
-          <w:color w:val="262626"/>
-          <w:sz w:val="22"/>
-          <w:lang w:val="en-US"/>
-        </w:rPr>
-        <w:t xml:space="preserve"> (10th ed.). Pearson.</w:t>
-      </w:r>
-    </w:p>
-    <w:p>
-      <w:pPr>
-        <w:spacing w:after="120"/>
-        <w:ind w:left="560" w:hanging="560"/>
-        <w:rPr>
-          <w:lang w:val="en-US"/>
-        </w:rPr>
-      </w:pPr>
-      <w:r>
-        <w:rPr>
-          <w:rFonts w:ascii="Arial" w:eastAsia="Arial" w:hAnsi="Arial" w:cs="Arial"/>
-          <w:color w:val="262626"/>
-          <w:sz w:val="22"/>
-          <w:lang w:val="en-US"/>
-        </w:rPr>
-        <w:t xml:space="preserve">Transbank. (s. f.). </w:t>
-      </w:r>
-      <w:r>
-        <w:rPr>
-          <w:rFonts w:ascii="Arial" w:eastAsia="Arial" w:hAnsi="Arial" w:cs="Arial"/>
-          <w:i/>
-          <w:color w:val="262626"/>
-          <w:sz w:val="22"/>
-          <w:lang w:val="en-US"/>
-        </w:rPr>
-        <w:t>Webpay Plus</w:t>
-      </w:r>
-      <w:r>
-        <w:rPr>
-          <w:rFonts w:ascii="Arial" w:eastAsia="Arial" w:hAnsi="Arial" w:cs="Arial"/>
-          <w:color w:val="262626"/>
-          <w:sz w:val="22"/>
-          <w:lang w:val="en-US"/>
-        </w:rPr>
-        <w:t>. Transbank Developers. https://www.transbankdevelopers.cl/documentacion/webpay-plus</w:t>
+        <w:t>Looking at the rubric, I think our strongest indicator is the evidence: every feature can be shown working, with tests and a pull request behind it. The weakest one is the formal side of the project. In Phase 1 I said I wanted to improve the documentation, and the system moved faster than the report, so now I have to close that gap. I also learned that a dependency outside the team can stop a feature in one day, as Mercado Pago did, so now I look for a plan B before choosing a service.</w:t>
       </w:r>
     </w:p>
     <w:sectPr>
@@ -16788,7 +16615,12 @@
 </file>
 
 <file path=customXml/item3.xml><?xml version="1.0" encoding="utf-8"?>
-<b:Sources xmlns:b="http://schemas.openxmlformats.org/officeDocument/2006/bibliography" xmlns="http://schemas.openxmlformats.org/officeDocument/2006/bibliography" SelectedStyle="\APASixthEditionOfficeOnline.xsl" StyleName="APA" Version="6"/>
+<?mso-contentType ?>
+<FormTemplates xmlns="http://schemas.microsoft.com/sharepoint/v3/contenttype/forms">
+  <Display>DocumentLibraryForm</Display>
+  <Edit>DocumentLibraryForm</Edit>
+  <New>DocumentLibraryForm</New>
+</FormTemplates>
 </file>
 
 <file path=customXml/item4.xml><?xml version="1.0" encoding="utf-8"?>
@@ -16798,12 +16630,7 @@
 </file>
 
 <file path=customXml/item5.xml><?xml version="1.0" encoding="utf-8"?>
-<?mso-contentType ?>
-<FormTemplates xmlns="http://schemas.microsoft.com/sharepoint/v3/contenttype/forms">
-  <Display>DocumentLibraryForm</Display>
-  <Edit>DocumentLibraryForm</Edit>
-  <New>DocumentLibraryForm</New>
-</FormTemplates>
+<b:Sources xmlns:b="http://schemas.openxmlformats.org/officeDocument/2006/bibliography" xmlns="http://schemas.openxmlformats.org/officeDocument/2006/bibliography" SelectedStyle="\APASixthEditionOfficeOnline.xsl" StyleName="APA" Version="6"/>
 </file>
 
 <file path=customXml/itemProps1.xml><?xml version="1.0" encoding="utf-8"?>
@@ -16833,9 +16660,9 @@
 </file>
 
 <file path=customXml/itemProps3.xml><?xml version="1.0" encoding="utf-8"?>
-<ds:datastoreItem xmlns:ds="http://schemas.openxmlformats.org/officeDocument/2006/customXml" ds:itemID="{6C1D491A-3308-447D-9C5F-944707B97D56}">
+<ds:datastoreItem xmlns:ds="http://schemas.openxmlformats.org/officeDocument/2006/customXml" ds:itemID="{4EF1E242-F579-4982-B8CC-2FBF33737424}">
   <ds:schemaRefs>
-    <ds:schemaRef ds:uri="http://schemas.openxmlformats.org/officeDocument/2006/bibliography"/>
+    <ds:schemaRef ds:uri="http://schemas.microsoft.com/sharepoint/v3/contenttype/forms"/>
   </ds:schemaRefs>
 </ds:datastoreItem>
 </file>
@@ -16850,9 +16677,9 @@
 </file>
 
 <file path=customXml/itemProps5.xml><?xml version="1.0" encoding="utf-8"?>
-<ds:datastoreItem xmlns:ds="http://schemas.openxmlformats.org/officeDocument/2006/customXml" ds:itemID="{4EF1E242-F579-4982-B8CC-2FBF33737424}">
+<ds:datastoreItem xmlns:ds="http://schemas.openxmlformats.org/officeDocument/2006/customXml" ds:itemID="{6C1D491A-3308-447D-9C5F-944707B97D56}">
   <ds:schemaRefs>
-    <ds:schemaRef ds:uri="http://schemas.microsoft.com/sharepoint/v3/contenttype/forms"/>
+    <ds:schemaRef ds:uri="http://schemas.openxmlformats.org/officeDocument/2006/bibliography"/>
   </ds:schemaRefs>
 </ds:datastoreItem>
 </file>
</xml_diff>